<commit_message>
Alinear la tesis v4 con los datos reales 2016-2025 como segunda capa de revisiones
Co-Authored-By: Claude Sonnet 5.5 <noreply@anthropic.com>
</commit_message>
<xml_diff>
--- a/docs/Proyecto_Tesis_Maestria_UNMSM_WMSR_v4.docx
+++ b/docs/Proyecto_Tesis_Maestria_UNMSM_WMSR_v4.docx
@@ -4580,8 +4580,18 @@
         <w:t xml:space="preserve">Tamaño temporal efectivo. </w:t>
       </w:r>
       <w:r>
-        <w:t xml:space="preserve">El periodo enmendado contiene hasta 10 campañas (2016-2025), pero no se asumirá que sean independientes. La cobertura definitiva, la autocorrelación y la ventana inicial de entrenamiento limitarán el número de campañas externas y la potencia de los contrastes.</w:t>
-      </w:r>
+        <w:t xml:space="preserve">El periodo enmendado contiene hasta 10 campañas (2016-2025), pero no se asumirá que sean independientes. </w:t>
+      </w:r>
+      <w:del w:id="20001" w:author="Claude (alineación con los datos)" w:date="2026-10-17T23:30:00Z">
+        <w:r>
+          <w:delText>La cobertura definitiva, la autocorrelación y la ventana inicial de entrenamiento limitarán el número de campañas externas y la potencia de los contrastes.</w:delText>
+        </w:r>
+      </w:del>
+      <w:ins w:id="20002" w:author="Claude (alineación con los datos)" w:date="2026-10-17T23:30:00Z">
+        <w:r>
+          <w:t>Con una ventana inicial de cinco campañas (2016-2020) quedan cinco campañas externas (2021-2025): la regla exacta de signos solo alcanza el nivel 0,5⁵ = 0,031 y una sola campaña desfavorable basta para que no se sostenga la no inferioridad. La autocorrelación limita además la potencia de los contrastes.</w:t>
+        </w:r>
+      </w:ins>
     </w:p>
     <w:p>
       <w:pPr>
@@ -8419,8 +8429,18 @@
         <w:ind w:left="340" w:hanging="340"/>
       </w:pPr>
       <w:r>
-        <w:t xml:space="preserve">• Tiempo. Campañas 2015/2016 a 2024/2025 (año de cosecha 2016 a 2025), sujetas a la cobertura efectiva de la serie provincial. El periodo se fijó tras la auditoría H1 y se confirma antes del entrenamiento.</w:t>
-      </w:r>
+        <w:t xml:space="preserve">• Tiempo. Campañas 2015/2016 a 2024/2025 (año de cosecha 2016 a 2025), sujetas a la cobertura efectiva de la serie provincial. </w:t>
+      </w:r>
+      <w:del w:id="20003" w:author="Claude (alineación con los datos)" w:date="2026-10-17T23:30:00Z">
+        <w:r>
+          <w:delText>El periodo se fijó tras la auditoría H1 y se confirma antes del entrenamiento.</w:delText>
+        </w:r>
+      </w:del>
+      <w:ins w:id="20004" w:author="Claude (alineación con los datos)" w:date="2026-10-17T23:30:00Z">
+        <w:r>
+          <w:t>El periodo se fijó tras la auditoría H1 y la preparación de datos lo confirmó: 601 observaciones provincia-campaña de 66 provincias (Tabla 5).</w:t>
+        </w:r>
+      </w:ins>
       <w:r>
         <w:rPr>
           <w:b/>
@@ -9882,8 +9902,18 @@
         <w:ind w:firstLine="425"/>
       </w:pPr>
       <w:r>
-        <w:t>El conteo se presentará como una cascada que separe las cifras verificadas de las pendientes. No se asumirá un tamaño poblacional aproximado mediante tasas de ocupación no observadas. La auditoría H1 determinará el número definitivo de celdas con producción y predictores suficientes.</w:t>
-      </w:r>
+        <w:t xml:space="preserve">El conteo se presentará como una cascada que separe las cifras verificadas de las pendientes. No se asumirá un tamaño poblacional aproximado mediante tasas de ocupación no observadas. </w:t>
+      </w:r>
+      <w:del w:id="20005" w:author="Claude (alineación con los datos)" w:date="2026-10-17T23:30:00Z">
+        <w:r>
+          <w:delText>La auditoría H1 determinará el número definitivo de celdas con producción y predictores suficientes.</w:delText>
+        </w:r>
+      </w:del>
+      <w:ins w:id="20006" w:author="Claude (alineación con los datos)" w:date="2026-10-17T23:30:00Z">
+        <w:r>
+          <w:t>La auditoría H1 y la preparación de datos determinaron el número definitivo de celdas con producción y predictores suficientes: 601 (Tabla 5).</w:t>
+        </w:r>
+      </w:ins>
     </w:p>
     <w:p>
       <w:pPr>
@@ -10492,36 +10522,58 @@
                 <w:szCs w:val="32"/>
               </w:rPr>
             </w:pPr>
-            <w:r>
+            <w:del w:id="20007" w:author="Claude (alineación con los datos)" w:date="2026-10-17T23:30:00Z">
+              <w:r>
+                <w:rPr>
+                  <w:sz w:val="20"/>
+                  <w:szCs w:val="32"/>
+                </w:rPr>
+                <w:delText>604</w:delText>
+              </w:r>
+            </w:del>
+            <w:ins w:id="20008" w:author="Claude (alineación con los datos)" w:date="2026-10-17T23:30:00Z">
+              <w:r>
+                <w:rPr>
+                  <w:sz w:val="20"/>
+                  <w:szCs w:val="32"/>
+                </w:rPr>
+                <w:t>674</w:t>
+              </w:r>
+            </w:ins>
+          </w:p>
+        </w:tc>
+        <w:tc>
+          <w:tcPr>
+            <w:tcW w:w="2347" w:type="dxa"/>
+            <w:vAlign w:val="center"/>
+          </w:tcPr>
+          <w:p>
+            <w:pPr>
+              <w:spacing w:after="0" w:line="240" w:lineRule="auto"/>
+              <w:jc w:val="left"/>
               <w:rPr>
                 <w:sz w:val="20"/>
                 <w:szCs w:val="32"/>
               </w:rPr>
-              <w:t>604</w:t>
-            </w:r>
-          </w:p>
-        </w:tc>
-        <w:tc>
-          <w:tcPr>
-            <w:tcW w:w="2347" w:type="dxa"/>
-            <w:vAlign w:val="center"/>
-          </w:tcPr>
-          <w:p>
-            <w:pPr>
-              <w:spacing w:after="0" w:line="240" w:lineRule="auto"/>
-              <w:jc w:val="left"/>
-              <w:rPr>
-                <w:sz w:val="20"/>
-                <w:szCs w:val="32"/>
-              </w:rPr>
-            </w:pPr>
-            <w:r>
-              <w:rPr>
-                <w:sz w:val="20"/>
-                <w:szCs w:val="32"/>
-              </w:rPr>
-              <w:t>Confirmado: 604 de 620 celdas elegibles (97,4 % de cobertura real), Hito H1, 2026-09-12.</w:t>
-            </w:r>
+            </w:pPr>
+            <w:del w:id="20009" w:author="Claude (alineación con los datos)" w:date="2026-10-17T23:30:00Z">
+              <w:r>
+                <w:rPr>
+                  <w:sz w:val="20"/>
+                  <w:szCs w:val="32"/>
+                </w:rPr>
+                <w:delText>Confirmado: 604 de 620 celdas elegibles (97,4 % de cobertura real), Hito H1, 2026-09-12.</w:delText>
+              </w:r>
+            </w:del>
+            <w:ins w:id="20010" w:author="Claude (alineación con los datos)" w:date="2026-10-17T23:30:00Z">
+              <w:r>
+                <w:rPr>
+                  <w:sz w:val="20"/>
+                  <w:szCs w:val="32"/>
+                </w:rPr>
+                <w:t>Recuento real en 2016-2025: 674 celdas de 76 provincias con producción y superficie cosechada mayores que cero. Supera a N3 porque la producción registrada abarca más provincias que las 62 documentadas de forma preliminar (dentro de estas 62, la auditoría H1 contó 604 de 620 celdas, 97,4 %).</w:t>
+              </w:r>
+            </w:ins>
           </w:p>
         </w:tc>
       </w:tr>
@@ -10590,36 +10642,58 @@
                 <w:szCs w:val="32"/>
               </w:rPr>
             </w:pPr>
-            <w:r>
+            <w:del w:id="20011" w:author="Claude (alineación con los datos)" w:date="2026-10-17T23:30:00Z">
+              <w:r>
+                <w:rPr>
+                  <w:sz w:val="20"/>
+                  <w:szCs w:val="32"/>
+                </w:rPr>
+                <w:delText>Por determinar</w:delText>
+              </w:r>
+            </w:del>
+            <w:ins w:id="20012" w:author="Claude (alineación con los datos)" w:date="2026-10-17T23:30:00Z">
+              <w:r>
+                <w:rPr>
+                  <w:sz w:val="20"/>
+                  <w:szCs w:val="32"/>
+                </w:rPr>
+                <w:t>601</w:t>
+              </w:r>
+            </w:ins>
+          </w:p>
+        </w:tc>
+        <w:tc>
+          <w:tcPr>
+            <w:tcW w:w="2347" w:type="dxa"/>
+            <w:vAlign w:val="center"/>
+          </w:tcPr>
+          <w:p>
+            <w:pPr>
+              <w:spacing w:after="0" w:line="240" w:lineRule="auto"/>
+              <w:jc w:val="left"/>
               <w:rPr>
                 <w:sz w:val="20"/>
                 <w:szCs w:val="32"/>
               </w:rPr>
-              <w:t>Por determinar</w:t>
-            </w:r>
-          </w:p>
-        </w:tc>
-        <w:tc>
-          <w:tcPr>
-            <w:tcW w:w="2347" w:type="dxa"/>
-            <w:vAlign w:val="center"/>
-          </w:tcPr>
-          <w:p>
-            <w:pPr>
-              <w:spacing w:after="0" w:line="240" w:lineRule="auto"/>
-              <w:jc w:val="left"/>
-              <w:rPr>
-                <w:sz w:val="20"/>
-                <w:szCs w:val="32"/>
-              </w:rPr>
-            </w:pPr>
-            <w:r>
-              <w:rPr>
-                <w:sz w:val="20"/>
-                <w:szCs w:val="32"/>
-              </w:rPr>
-              <w:t>Tamaño definitivo del conjunto analítico.</w:t>
-            </w:r>
+            </w:pPr>
+            <w:del w:id="20013" w:author="Claude (alineación con los datos)" w:date="2026-10-17T23:30:00Z">
+              <w:r>
+                <w:rPr>
+                  <w:sz w:val="20"/>
+                  <w:szCs w:val="32"/>
+                </w:rPr>
+                <w:delText>Tamaño definitivo del conjunto analítico.</w:delText>
+              </w:r>
+            </w:del>
+            <w:ins w:id="20014" w:author="Claude (alineación con los datos)" w:date="2026-10-17T23:30:00Z">
+              <w:r>
+                <w:rPr>
+                  <w:sz w:val="20"/>
+                  <w:szCs w:val="32"/>
+                </w:rPr>
+                <w:t>Tamaño definitivo del conjunto analítico: 601 observaciones de 66 provincias, 571 de ellas con el tensor completo. De N4 se excluyeron 44 observaciones fuera del ámbito altoandino y 29 por ciclo fuera de la ventana de extracción.</w:t>
+              </w:r>
+            </w:ins>
           </w:p>
         </w:tc>
       </w:tr>
@@ -10633,15 +10707,24 @@
           <w:i/>
           <w:sz w:val="18"/>
         </w:rPr>
-        <w:lastRenderedPageBreak/>
         <w:t xml:space="preserve">Nota. </w:t>
       </w:r>
-      <w:r>
-        <w:rPr>
-          <w:sz w:val="18"/>
-        </w:rPr>
-        <w:t>N4 y N5 no se estimarán mediante tasas supuestas. Se informarán con desagregación por campaña y departamento al cierre de H1.</w:t>
-      </w:r>
+      <w:del w:id="20015" w:author="Claude (alineación con los datos)" w:date="2026-10-17T23:30:00Z">
+        <w:r>
+          <w:rPr>
+            <w:sz w:val="18"/>
+          </w:rPr>
+          <w:delText>N4 y N5 no se estimarán mediante tasas supuestas. Se informarán con desagregación por campaña y departamento al cierre de H1.</w:delText>
+        </w:r>
+      </w:del>
+      <w:ins w:id="20016" w:author="Claude (alineación con los datos)" w:date="2026-10-17T23:30:00Z">
+        <w:r>
+          <w:rPr>
+            <w:sz w:val="18"/>
+          </w:rPr>
+          <w:t>N4 y N5 son recuentos reales, no estimados mediante tasas supuestas. Observaciones por campaña: 2016, 60; 2017, 62; 2018, 60; 2019, 62; 2020, 58; 2021, 61; 2022, 60; 2023, 60; 2024, 60; 2025, 58.</w:t>
+        </w:r>
+      </w:ins>
     </w:p>
     <w:p>
       <w:pPr>
@@ -10660,8 +10743,18 @@
         <w:ind w:firstLine="425"/>
       </w:pPr>
       <w:r>
-        <w:t xml:space="preserve">El número de observaciones provincia-campaña no equivale al número de unidades independientes. Las provincias de una misma campaña comparten perturbaciones climáticas regionales y pueden presentar dependencia espacial; las campañas sucesivas también pueden estar autocorrelacionadas. En consecuencia, existirán hasta diez bloques temporales potenciales (periodo enmendado 2016-2025 tras la auditoría H1, 2026-09-12; ver sección 1.5), sujetos a cobertura y dependencia. Esta estructura limita el número de campañas externas y la potencia para detectar diferencias pequeñas.</w:t>
-      </w:r>
+        <w:t xml:space="preserve">El número de observaciones provincia-campaña no equivale al número de unidades independientes. Las provincias de una misma campaña comparten perturbaciones climáticas regionales y pueden presentar dependencia espacial; las campañas sucesivas también pueden estar autocorrelacionadas. En consecuencia, existirán hasta diez bloques temporales potenciales (periodo enmendado 2016-2025 tras la auditoría H1, 2026-09-12; ver sección 1.5), sujetos a cobertura y dependencia. </w:t>
+      </w:r>
+      <w:del w:id="20017" w:author="Claude (alineación con los datos)" w:date="2026-10-17T23:30:00Z">
+        <w:r>
+          <w:delText>Esta estructura limita el número de campañas externas y la potencia para detectar diferencias pequeñas.</w:delText>
+        </w:r>
+      </w:del>
+      <w:ins w:id="20018" w:author="Claude (alineación con los datos)" w:date="2026-10-17T23:30:00Z">
+        <w:r>
+          <w:t>Esta estructura limita el número de campañas externas y la potencia para detectar diferencias pequeñas: con la ventana inicial adoptada (cinco campañas, 2016-2020) quedan cinco campañas externas (2021-2025).</w:t>
+        </w:r>
+      </w:ins>
     </w:p>
     <w:p>
       <w:pPr>
@@ -10691,9 +10784,29 @@
         <w:spacing w:after="0"/>
         <w:ind w:firstLine="425"/>
       </w:pPr>
-      <w:r>
-        <w:t>El tamaño definitivo será N5 de la Tabla 5. No procede aplicar una fórmula de tamaño muestral basada en precisión y confianza, porque no se extraerá una submuestra para inferir sobre la población accesible. La capacidad del modelo y el número de campañas externas se ajustarán al tamaño observado después de H1.</w:t>
-      </w:r>
+      <w:del w:id="20019" w:author="Claude (alineación con los datos)" w:date="2026-10-17T23:30:00Z">
+        <w:r>
+          <w:delText>El tamaño definitivo será N5 de la Tabla 5.</w:delText>
+        </w:r>
+      </w:del>
+      <w:ins w:id="20020" w:author="Claude (alineación con los datos)" w:date="2026-10-17T23:30:00Z">
+        <w:r>
+          <w:t>El tamaño definitivo es N5 = 601 observaciones de la Tabla 5.</w:t>
+        </w:r>
+      </w:ins>
+      <w:r>
+        <w:t xml:space="preserve"> No procede aplicar una fórmula de tamaño muestral basada en precisión y confianza, porque no se extraerá una submuestra para inferir sobre la población accesible. </w:t>
+      </w:r>
+      <w:del w:id="20021" w:author="Claude (alineación con los datos)" w:date="2026-10-17T23:30:00Z">
+        <w:r>
+          <w:delText>La capacidad del modelo y el número de campañas externas se ajustarán al tamaño observado después de H1.</w:delText>
+        </w:r>
+      </w:del>
+      <w:ins w:id="20022" w:author="Claude (alineación con los datos)" w:date="2026-10-17T23:30:00Z">
+        <w:r>
+          <w:t>Con una ventana inicial de cinco campañas, el conjunto se reparte en 302 observaciones de entrenamiento (2016-2020) y 299 de las cinco campañas externas (2021-2025).</w:t>
+        </w:r>
+      </w:ins>
     </w:p>
     <w:p>
       <w:pPr>
@@ -12451,6 +12564,11 @@
       <w:r>
         <w:t>Los umbrales se calibrarán únicamente con campañas de entrenamiento o con fuentes externas independientes del resultado de prueba. La máscara reducirá la contaminación por coberturas no agrícolas, pero no distinguirá quinua de otros cultivos. Esta limitación se controlará mediante la proporción de superficie sembrada con quinua y análisis de sensibilidad por estratos de representatividad.</w:t>
       </w:r>
+      <w:ins w:id="20023" w:author="Claude (alineación con los datos)" w:date="2026-10-17T23:30:00Z">
+        <w:r>
+          <w:t xml:space="preserve"> La amplitud mínima de NDVI de la máscara se calibró solo con las campañas de entrenamiento 2016-2020 y quedó fijada en 0,323.</w:t>
+        </w:r>
+      </w:ins>
     </w:p>
     <w:p>
       <w:pPr>
@@ -12598,6 +12716,11 @@
       <w:r>
         <w:t>La variable objetivo será el rendimiento oficial de quinua en kg/ha. Debido a que las series provinciales pueden contener diferencias persistentes de nivel y tendencia tecnológica, el protocolo evaluará dos representaciones: rendimiento en nivel y anomalía respecto de una línea base provincial. La anomalía se utilizará como representación de modelado cuando mejore la capacidad de anticipar variaciones interanuales, pero no reemplazará el reporte del rendimiento reconstruido.</w:t>
       </w:r>
+      <w:ins w:id="20024" w:author="Claude (alineación con los datos)" w:date="2026-10-17T23:30:00Z">
+        <w:r>
+          <w:t xml:space="preserve"> En el piloto, con campañas de entrenamiento, la anomalía redujo el RMSE medio de 394,6 a 198,2 kg/ha (−49,8 %) frente al nivel, por lo que se adoptó como representación de modelado; el rendimiento se reporta siempre reconstruido en kg/ha.</w:t>
+        </w:r>
+      </w:ins>
     </w:p>
     <w:p>
       <w:pPr>
@@ -12605,8 +12728,31 @@
         <w:ind w:firstLine="425"/>
       </w:pPr>
       <w:r>
-        <w:t>La línea base se estimará con una tendencia temporal simple y reproducible ajustada exclusivamente en las campañas de entrenamiento. La forma definitiva —lineal o una alternativa suavizada preespecificada— se seleccionará en el piloto sin utilizar campañas externas y se mantendrá fija durante la evaluación. Las provincias con historia insuficiente emplearán una regla de respaldo documentada.</w:t>
-      </w:r>
+        <w:t xml:space="preserve">La línea base se estimará con una tendencia temporal simple y reproducible ajustada exclusivamente en las campañas de entrenamiento. La forma definitiva —lineal o una alternativa suavizada preespecificada— </w:t>
+      </w:r>
+      <w:del w:id="20025" w:author="Claude (alineación con los datos)" w:date="2026-10-17T23:30:00Z">
+        <w:r>
+          <w:delText>se seleccionará en el piloto sin utilizar campañas externas y se mantendrá fija durante la evaluación.</w:delText>
+        </w:r>
+      </w:del>
+      <w:ins w:id="20026" w:author="Claude (alineación con los datos)" w:date="2026-10-17T23:30:00Z">
+        <w:r>
+          <w:t>se seleccionó en el piloto sin utilizar campañas externas y se mantiene fija durante la evaluación: tendencia lineal por provincia con al menos cuatro campañas de entrenamiento.</w:t>
+        </w:r>
+      </w:ins>
+      <w:r>
+        <w:t xml:space="preserve"> </w:t>
+      </w:r>
+      <w:del w:id="20027" w:author="Claude (alineación con los datos)" w:date="2026-10-17T23:30:00Z">
+        <w:r>
+          <w:delText>Las provincias con historia insuficiente emplearán una regla de respaldo documentada.</w:delText>
+        </w:r>
+      </w:del>
+      <w:ins w:id="20028" w:author="Claude (alineación con los datos)" w:date="2026-10-17T23:30:00Z">
+        <w:r>
+          <w:t>Las provincias con menos de cuatro campañas de entrenamiento emplean la media provincial.</w:t>
+        </w:r>
+      </w:ins>
     </w:p>
     <w:p>
       <w:pPr>
@@ -12667,8 +12813,18 @@
         <w:t xml:space="preserve">Validación temporal prospectiva principal. </w:t>
       </w:r>
       <w:r>
-        <w:t xml:space="preserve">Se empleará origen móvil. Para cada campaña externa, el entrenamiento y la selección de hiperparámetros utilizarán únicamente campañas anteriores. La ventana inicial mínima se definirá en el piloto con base en la cobertura y se registrará antes de la evaluación.</w:t>
-      </w:r>
+        <w:t xml:space="preserve">Se empleará origen móvil. Para cada campaña externa, el entrenamiento y la selección de hiperparámetros utilizarán únicamente campañas anteriores. </w:t>
+      </w:r>
+      <w:del w:id="20029" w:author="Claude (alineación con los datos)" w:date="2026-10-17T23:30:00Z">
+        <w:r>
+          <w:delText>La ventana inicial mínima se definirá en el piloto con base en la cobertura y se registrará antes de la evaluación.</w:delText>
+        </w:r>
+      </w:del>
+      <w:ins w:id="20030" w:author="Claude (alineación con los datos)" w:date="2026-10-17T23:30:00Z">
+        <w:r>
+          <w:t>La ventana inicial es de cinco campañas (2016-2020), fijada en la preespecificación tras el piloto y registrada antes de la evaluación; deja cinco campañas externas (2021-2025).</w:t>
+        </w:r>
+      </w:ins>
     </w:p>
     <w:p>
       <w:pPr>

</xml_diff>

<commit_message>
Alinear en la tesis v4 la clasificacion territorial y la fila N2 de la Tabla 5 con los datos
Co-Authored-By: Claude Sonnet 5.5 <noreply@anthropic.com>
</commit_message>
<xml_diff>
--- a/docs/Proyecto_Tesis_Maestria_UNMSM_WMSR_v4.docx
+++ b/docs/Proyecto_Tesis_Maestria_UNMSM_WMSR_v4.docx
@@ -8508,6 +8508,11 @@
       <w:r>
         <w:t>La Tabla 4 presenta una delimitación preliminar. La clasificación definitiva se verificará con la fuente territorial oficial seleccionada en H1. En las provincias de transición, la altitud media de la superficie agrícola se utilizará como criterio complementario y se documentará como decisión operacional, no como una frontera natural universal.</w:t>
       </w:r>
+      <w:ins w:id="30001" w:author="Claude (alineación con los datos)" w:date="2026-10-17T23:50:00Z">
+        <w:r>
+          <w:t xml:space="preserve"> La clasificación utilizada en el análisis (63 provincias altoandinas, 4 de transición —Carabaya, Sandia, La Mar y Huanta—, 9 costeras bajo riego y 3 de selva) coincide con la Tabla 4; Gran Chimú sigue pendiente de verificación y se conservó marcada, con una observación.</w:t>
+        </w:r>
+      </w:ins>
     </w:p>
     <w:p>
       <w:pPr>
@@ -10308,7 +10313,32 @@
                 <w:sz w:val="20"/>
                 <w:szCs w:val="32"/>
               </w:rPr>
-              <w:t>Exclusión preliminar de diez provincias costeras bajo riego y Gran Chimú (pendiente de verificación).</w:t>
+              <w:t xml:space="preserve">Exclusión preliminar de </w:t>
+            </w:r>
+            <w:del w:id="30002" w:author="Claude (alineación con los datos)" w:date="2026-10-17T23:50:00Z">
+              <w:r>
+                <w:rPr>
+                  <w:sz w:val="20"/>
+                  <w:szCs w:val="32"/>
+                </w:rPr>
+                <w:delText>diez provincias costeras bajo riego y Gran Chimú (pendiente de verificación)</w:delText>
+              </w:r>
+            </w:del>
+            <w:ins w:id="30003" w:author="Claude (alineación con los datos)" w:date="2026-10-17T23:50:00Z">
+              <w:r>
+                <w:rPr>
+                  <w:sz w:val="20"/>
+                  <w:szCs w:val="32"/>
+                </w:rPr>
+                <w:t>nueve provincias costeras bajo riego y Gran Chimú (clasificación pendiente de verificación)</w:t>
+              </w:r>
+            </w:ins>
+            <w:r>
+              <w:rPr>
+                <w:sz w:val="20"/>
+                <w:szCs w:val="32"/>
+              </w:rPr>
+              <w:t>.</w:t>
             </w:r>
           </w:p>
         </w:tc>
@@ -10356,6 +10386,15 @@
               </w:rPr>
               <w:t>Confirmado con datos reales (Hito H1).</w:t>
             </w:r>
+            <w:ins w:id="30004" w:author="Claude (alineación con los datos)" w:date="2026-10-17T23:50:00Z">
+              <w:r>
+                <w:rPr>
+                  <w:sz w:val="20"/>
+                  <w:szCs w:val="32"/>
+                </w:rPr>
+                <w:t xml:space="preserve"> En la depuración final se excluyeron las 44 celdas de las nueve provincias costeras con producción; Gran Chimú se conservó, marcada, con una observación.</w:t>
+              </w:r>
+            </w:ins>
           </w:p>
         </w:tc>
       </w:tr>

</xml_diff>